<commit_message>
Agregar docker build workflow
</commit_message>
<xml_diff>
--- a/evidencias/ACTIVIDAD 1.docx
+++ b/evidencias/ACTIVIDAD 1.docx
@@ -50,6 +50,9 @@
     </w:p>
     <w:p>
       <w:r>
+        <w:rPr>
+          <w:noProof/>
+        </w:rPr>
         <w:drawing>
           <wp:inline distT="0" distB="0" distL="0" distR="0" wp14:anchorId="6C67710D" wp14:editId="74CD8967">
             <wp:extent cx="5612130" cy="3032125"/>
@@ -89,6 +92,9 @@
     </w:p>
     <w:p>
       <w:r>
+        <w:rPr>
+          <w:noProof/>
+        </w:rPr>
         <w:drawing>
           <wp:inline distT="0" distB="0" distL="0" distR="0" wp14:anchorId="06AA1AC5" wp14:editId="076EB3AF">
             <wp:extent cx="5612130" cy="1878965"/>
@@ -129,6 +135,9 @@
         <w:br/>
       </w:r>
       <w:r>
+        <w:rPr>
+          <w:noProof/>
+        </w:rPr>
         <w:drawing>
           <wp:inline distT="0" distB="0" distL="0" distR="0" wp14:anchorId="379F4A32" wp14:editId="36B897A6">
             <wp:extent cx="5612130" cy="2278380"/>
@@ -287,6 +296,9 @@
     </w:p>
     <w:p>
       <w:r>
+        <w:rPr>
+          <w:noProof/>
+        </w:rPr>
         <w:lastRenderedPageBreak/>
         <w:drawing>
           <wp:inline distT="0" distB="0" distL="0" distR="0" wp14:anchorId="7D8DC7DC" wp14:editId="3D8506EC">
@@ -328,6 +340,9 @@
         <w:br/>
       </w:r>
       <w:r>
+        <w:rPr>
+          <w:noProof/>
+        </w:rPr>
         <w:drawing>
           <wp:inline distT="0" distB="0" distL="0" distR="0" wp14:anchorId="7089BB71" wp14:editId="6E2402A4">
             <wp:extent cx="5612130" cy="2310765"/>
@@ -368,6 +383,9 @@
         <w:br/>
       </w:r>
       <w:r>
+        <w:rPr>
+          <w:noProof/>
+        </w:rPr>
         <w:drawing>
           <wp:inline distT="0" distB="0" distL="0" distR="0" wp14:anchorId="7E203F7A" wp14:editId="3630309E">
             <wp:extent cx="4610743" cy="3534268"/>
@@ -489,6 +507,9 @@
     </w:p>
     <w:p>
       <w:r>
+        <w:rPr>
+          <w:noProof/>
+        </w:rPr>
         <w:drawing>
           <wp:inline distT="0" distB="0" distL="0" distR="0" wp14:anchorId="13F7113E" wp14:editId="10CC371F">
             <wp:extent cx="5612130" cy="2732405"/>
@@ -529,6 +550,9 @@
         <w:br/>
       </w:r>
       <w:r>
+        <w:rPr>
+          <w:noProof/>
+        </w:rPr>
         <w:drawing>
           <wp:inline distT="0" distB="0" distL="0" distR="0" wp14:anchorId="23B73D9A" wp14:editId="47C30F5E">
             <wp:extent cx="2305372" cy="1781424"/>
@@ -569,6 +593,9 @@
         <w:br/>
       </w:r>
       <w:r>
+        <w:rPr>
+          <w:noProof/>
+        </w:rPr>
         <w:lastRenderedPageBreak/>
         <w:drawing>
           <wp:inline distT="0" distB="0" distL="0" distR="0" wp14:anchorId="0002E404" wp14:editId="09F21AB7">
@@ -618,6 +645,12 @@
       </w:r>
     </w:p>
     <w:p>
+      <w:pPr>
+        <w:rPr>
+          <w:b/>
+          <w:bCs/>
+        </w:rPr>
+      </w:pPr>
       <w:r>
         <w:t xml:space="preserve">Se creó un </w:t>
       </w:r>
@@ -684,6 +717,132 @@
       <w:proofErr w:type="spellEnd"/>
       <w:r>
         <w:t xml:space="preserve"> y la carpeta app. La validación finalizó correctamente, demostrando que la estructura del proyecto cumple con los requisitos definidos.</w:t>
+      </w:r>
+      <w:r>
+        <w:br/>
+      </w:r>
+      <w:r>
+        <w:br/>
+      </w:r>
+      <w:r>
+        <w:rPr>
+          <w:b/>
+          <w:bCs/>
+        </w:rPr>
+        <w:t xml:space="preserve">ACTIVIDAD 4 - </w:t>
+      </w:r>
+      <w:proofErr w:type="spellStart"/>
+      <w:r>
+        <w:rPr>
+          <w:b/>
+          <w:bCs/>
+        </w:rPr>
+        <w:t>Artifact</w:t>
+      </w:r>
+      <w:proofErr w:type="spellEnd"/>
+      <w:r>
+        <w:br/>
+      </w:r>
+      <w:r>
+        <w:br/>
+      </w:r>
+      <w:r>
+        <w:lastRenderedPageBreak/>
+        <w:drawing>
+          <wp:inline distT="0" distB="0" distL="0" distR="0" wp14:anchorId="57852C8F" wp14:editId="37206BAC">
+            <wp:extent cx="5612130" cy="4547870"/>
+            <wp:effectExtent l="0" t="0" r="7620" b="5080"/>
+            <wp:docPr id="3" name="Imagen 3"/>
+            <wp:cNvGraphicFramePr>
+              <a:graphicFrameLocks xmlns:a="http://schemas.openxmlformats.org/drawingml/2006/main" noChangeAspect="1"/>
+            </wp:cNvGraphicFramePr>
+            <a:graphic xmlns:a="http://schemas.openxmlformats.org/drawingml/2006/main">
+              <a:graphicData uri="http://schemas.openxmlformats.org/drawingml/2006/picture">
+                <pic:pic xmlns:pic="http://schemas.openxmlformats.org/drawingml/2006/picture">
+                  <pic:nvPicPr>
+                    <pic:cNvPr id="1" name=""/>
+                    <pic:cNvPicPr/>
+                  </pic:nvPicPr>
+                  <pic:blipFill>
+                    <a:blip r:embed="rId13"/>
+                    <a:stretch>
+                      <a:fillRect/>
+                    </a:stretch>
+                  </pic:blipFill>
+                  <pic:spPr>
+                    <a:xfrm>
+                      <a:off x="0" y="0"/>
+                      <a:ext cx="5612130" cy="4547870"/>
+                    </a:xfrm>
+                    <a:prstGeom prst="rect">
+                      <a:avLst/>
+                    </a:prstGeom>
+                  </pic:spPr>
+                </pic:pic>
+              </a:graphicData>
+            </a:graphic>
+          </wp:inline>
+        </w:drawing>
+      </w:r>
+      <w:r>
+        <w:br/>
+      </w:r>
+      <w:r>
+        <w:drawing>
+          <wp:inline distT="0" distB="0" distL="0" distR="0" wp14:anchorId="3E2795DA" wp14:editId="0FACA331">
+            <wp:extent cx="4620270" cy="3324689"/>
+            <wp:effectExtent l="0" t="0" r="8890" b="9525"/>
+            <wp:docPr id="4" name="Imagen 4"/>
+            <wp:cNvGraphicFramePr>
+              <a:graphicFrameLocks xmlns:a="http://schemas.openxmlformats.org/drawingml/2006/main" noChangeAspect="1"/>
+            </wp:cNvGraphicFramePr>
+            <a:graphic xmlns:a="http://schemas.openxmlformats.org/drawingml/2006/main">
+              <a:graphicData uri="http://schemas.openxmlformats.org/drawingml/2006/picture">
+                <pic:pic xmlns:pic="http://schemas.openxmlformats.org/drawingml/2006/picture">
+                  <pic:nvPicPr>
+                    <pic:cNvPr id="1" name=""/>
+                    <pic:cNvPicPr/>
+                  </pic:nvPicPr>
+                  <pic:blipFill>
+                    <a:blip r:embed="rId14"/>
+                    <a:stretch>
+                      <a:fillRect/>
+                    </a:stretch>
+                  </pic:blipFill>
+                  <pic:spPr>
+                    <a:xfrm>
+                      <a:off x="0" y="0"/>
+                      <a:ext cx="4620270" cy="3324689"/>
+                    </a:xfrm>
+                    <a:prstGeom prst="rect">
+                      <a:avLst/>
+                    </a:prstGeom>
+                  </pic:spPr>
+                </pic:pic>
+              </a:graphicData>
+            </a:graphic>
+          </wp:inline>
+        </w:drawing>
+      </w:r>
+      <w:r>
+        <w:br/>
+      </w:r>
+    </w:p>
+    <w:p>
+      <w:r>
+        <w:rPr>
+          <w:b/>
+          <w:bCs/>
+        </w:rPr>
+        <w:lastRenderedPageBreak/>
+        <w:t>ACTIVIDAD 5 - Pipeline CI/CD</w:t>
+      </w:r>
+      <w:r>
+        <w:rPr>
+          <w:b/>
+          <w:bCs/>
+        </w:rPr>
+        <w:br/>
       </w:r>
     </w:p>
     <w:p/>

</xml_diff>